<commit_message>
Address database integrity review feedback
</commit_message>
<xml_diff>
--- a/Baran_Atici.docx
+++ b/Baran_Atici.docx
@@ -7811,10 +7811,7 @@
     </w:p>
     <w:p>
       <w:r>
-        <w:rPr>
-          <w:b/>
-        </w:rPr>
-        <w:t>Her tablo için Listele / Bul / Ekle / Güncelle / Sil olmak üzere 40 temel CRUD SP ve sp_ProfilBanGuncelle özel aksiyonu ile toplam 41 SP:</w:t>
+        <w:t>Her tablo icin Listele / Bul / Ekle / Guncelle / Sil olmak uzere 40 temel CRUD SP, sp_ProfilBanGuncelle ozel aksiyonu ve sp_KullaniciCakismaKontrol is kurali kontrol yordami ile toplam 42 SP:</w:t>
       </w:r>
     </w:p>
     <w:tbl>
@@ -7936,20 +7933,8 @@
             <w:vAlign w:val="center"/>
           </w:tcPr>
           <w:p>
-            <w:pPr>
-              <w:spacing w:after="0"/>
-            </w:pPr>
-            <w:r>
-              <w:rPr>
-                <w:sz w:val="19"/>
-              </w:rPr>
-            </w:r>
-            <w:r>
-              <w:rPr>
-                <w:b w:val="0"/>
-                <w:sz w:val="19"/>
-              </w:rPr>
-              <w:t>sp_KullaniciListele, sp_KullaniciBul, sp_KullaniciEkle, sp_KullaniciGuncelle, sp_KullaniciSil</w:t>
+            <w:r>
+              <w:t>sp_KullaniciListele, sp_KullaniciBul, sp_KullaniciCakismaKontrol, sp_KullaniciEkle, sp_KullaniciGuncelle, sp_KullaniciSil</w:t>
             </w:r>
           </w:p>
         </w:tc>
@@ -8378,10 +8363,13 @@
     <w:p/>
     <w:p>
       <w:r>
-        <w:rPr>
-          <w:b w:val="0"/>
-        </w:rPr>
-        <w:t>Listeleme SP'leri JOIN ile zenginleştirilmiş, içerik listesi yazar adını ve kategori adını, yorum listesi içerik başlığını da döndürür. Kullanıcı listesi ayrıca fn_KullaniciIcerikSayisi() fonksiyonunu çağırarak kullanıcı başına içerik sayısını hesaplar.</w:t>
+        <w:t>Listeleme SP'leri JOIN ile zenginlestirilmis, icerik listesi yazar adini ve kategori adini, yorum listesi icerik basligini da dondurur. Kullanici listesi ayrica fn_KullaniciIcerikSayisi() fonksiyonunu cagirarak kullanici basina icerik sayisini hesaplar. sp_IcerikListele, listeleme performansi icin yorum/begeni/kaydetme sayilarini satir basina scalar function cagirmak yerine toplu aggregate alt sorgularla uretir. Junction tablo guncelleme yordamlari, normal kullanici davranisi icin degil yonetim panelinden hatali iliski eslesmesini duzeltmek icin tutulmustur.</w:t>
+      </w:r>
+    </w:p>
+    <w:p>
+      <w:pPr/>
+      <w:r>
+        <w:t>sp_KullaniciSil, kullanicinin icerik, yorum veya etkilesim kayitlari varsa fiziksel silme yapmadan once SIGNAL SQLSTATE '45000' ile islemi durdurur. Boylece foreign key hatasinin ham sekilde ekrana dusmesi yerine BL katmaninda kullanici dostu mesaja cevrilen bilincli bir is kurali uygulanir. DELETE islemleri ayrica /yonetim-sistemi/ tarafinda superuser_required yetkilendirmesiyle sinirlandirilir.</w:t>
       </w:r>
     </w:p>
     <w:p>
@@ -10269,20 +10257,8 @@
             <w:vAlign w:val="center"/>
           </w:tcPr>
           <w:p>
-            <w:pPr>
-              <w:spacing w:after="0"/>
-            </w:pPr>
-            <w:r>
-              <w:rPr>
-                <w:sz w:val="19"/>
-              </w:rPr>
-            </w:r>
-            <w:r>
-              <w:rPr>
-                <w:b w:val="0"/>
-                <w:sz w:val="19"/>
-              </w:rPr>
-              <w:t>Çalıştırılabilir DDL + 41 SP + 3 Function + 8 Trigger</w:t>
+            <w:r>
+              <w:t>Çalıştırılabilir DDL + 42 SP + 3 Function + 8 Trigger</w:t>
             </w:r>
           </w:p>
         </w:tc>

</xml_diff>

<commit_message>
Add stored procedure driven analytics dashboard
</commit_message>
<xml_diff>
--- a/Baran_Atici.docx
+++ b/Baran_Atici.docx
@@ -7811,7 +7811,7 @@
     </w:p>
     <w:p>
       <w:r>
-        <w:t>Her tablo icin Listele / Bul / Ekle / Guncelle / Sil olmak uzere 40 temel CRUD SP, sp_ProfilBanGuncelle ozel aksiyonu ve sp_KullaniciCakismaKontrol is kurali kontrol yordami ile toplam 42 SP:</w:t>
+        <w:t>Her tablo icin Listele / Bul / Ekle / Guncelle / Sil olmak uzere 40 temel CRUD SP, sp_ProfilBanGuncelle ozel aksiyonu, sp_KullaniciCakismaKontrol is kurali kontrol yordami ve 2 BI raporlama yordami ile toplam 44 SP:</w:t>
       </w:r>
     </w:p>
     <w:tbl>
@@ -8359,6 +8359,28 @@
           </w:p>
         </w:tc>
       </w:tr>
+      <w:tr>
+        <w:tc>
+          <w:tcPr>
+            <w:tcW w:type="dxa" w:w="2500"/>
+          </w:tcPr>
+          <w:p>
+            <w:r>
+              <w:t>BI raporlama</w:t>
+            </w:r>
+          </w:p>
+        </w:tc>
+        <w:tc>
+          <w:tcPr>
+            <w:tcW w:type="dxa" w:w="6860"/>
+          </w:tcPr>
+          <w:p>
+            <w:r>
+              <w:t>sp_AylikEtkilesimAnalizi, sp_KategoriDagilimiRaporu</w:t>
+            </w:r>
+          </w:p>
+        </w:tc>
+      </w:tr>
     </w:tbl>
     <w:p/>
     <w:p>
@@ -8370,6 +8392,12 @@
       <w:pPr/>
       <w:r>
         <w:t>sp_KullaniciSil, kullanicinin icerik, yorum veya etkilesim kayitlari varsa fiziksel silme yapmadan once SIGNAL SQLSTATE '45000' ile islemi durdurur. Boylece foreign key hatasinin ham sekilde ekrana dusmesi yerine BL katmaninda kullanici dostu mesaja cevrilen bilincli bir is kurali uygulanir. DELETE islemleri ayrica /yonetim-sistemi/ tarafinda superuser_required yetkilendirmesiyle sinirlandirilir.</w:t>
+      </w:r>
+    </w:p>
+    <w:p>
+      <w:pPr/>
+      <w:r>
+        <w:t>Dashboard BI grafikleri de ayni N-Tier zincirine baglidir: /yonetim-sistemi/ dashboardu BL uzerinden DALi cagirir, DAL yalnizca CALL sp_AylikEtkilesimAnalizi() ve CALL sp_KategoriDagilimiRaporu() calistirir. Chart.js sadece sunum katmaninda gorsellestirme icin kullanilir.</w:t>
       </w:r>
     </w:p>
     <w:p>
@@ -10258,7 +10286,7 @@
           </w:tcPr>
           <w:p>
             <w:r>
-              <w:t>Çalıştırılabilir DDL + 42 SP + 3 Function + 8 Trigger</w:t>
+              <w:t>Çalıştırılabilir DDL + 44 SP + 3 Function + 8 Trigger</w:t>
             </w:r>
           </w:p>
         </w:tc>

</xml_diff>